<commit_message>
feat: hoan tat phien crash-safety, startup nhanh va giao dien dep hon
- crash/UI: bat loi o event Qt slot (crash.log), AI loi khoi dong van mo app
  offline, splash Tk giu nguyen goi dien va bo root.quit() gay Tcl_AsyncDelete
- startup: import main_window 2.02s -> 0.57s (lazy docx/fitz/openpyxl/AESGCM)
- chuyen man hinh: overlay fade thay cho QGraphicsOpacityEffect tren ca
  stacked widget; moi duong (ke ca qua Trang chu) deu co hieu ung
- Trang chu: hover nang len + bong do, sua 3 loi cat chu/lech nut/do rong
  card, go hieu ung opacity thua sau animation vao
- tro giup: 5 nhom/12 muc, icon emoji, noi dung dung 5 ngon ngu va kiem
  chung dung nhan nut that
- canh bao mem: anh > 1 MB, bai > 50 cau (khong chan)
- tai lieu .md cap nhat khop code + new.txt; .gitignore bo thu muc sinh
  tu dong (preview_edge_profile, firebase staging, WWBM-master)
- test: 393/393 PASS
</commit_message>
<xml_diff>
--- a/docs/mẫu.docx
+++ b/docs/mẫu.docx
@@ -12,17 +12,17 @@
     </w:p>
     <w:p>
       <w:r>
-        <w:t>Sử dụng file này để nhập câu hỏi vào EduPlay Studio</w:t>
+        <w:t>Sử dụng tệp này để nhập câu hỏi vào EduPlay Studio</w:t>
       </w:r>
     </w:p>
     <w:p>
       <w:r>
-        <w:t>LƯU Ý: Game "Ai là triệu phú" CHỈ hỗ trợ câu hỏi Trắc nghiệm.</w:t>
+        <w:t>LƯU Ý: "Ai muốn trở thành triệu phú" CHỈ hỗ trợ các câu hỏi trắc nghiệm.</w:t>
       </w:r>
     </w:p>
     <w:p>
       <w:r>
-        <w:t>"Quiz Cổ điển" và "Game Bắt cá" hỗ trợ TẤT CẢ các dạng câu hỏi bên dưới.</w:t>
+        <w:t>"Trắc nghiệm cổ điển" và "Trò chơi câu cá" hỗ trợ TẤT CẢ các loại câu hỏi dưới đây.</w:t>
       </w:r>
     </w:p>
     <w:p/>
@@ -36,22 +36,27 @@
     </w:p>
     <w:p>
       <w:r>
-        <w:t>1. Không thay đổi các tiêu đề in đậm.</w:t>
+        <w:t>1. Mỗi câu hỏi chứa: văn bản câu hỏi → các tùy chọn trả lời (A, B, C, D...) → giải thích (tùy chọn)</w:t>
       </w:r>
     </w:p>
     <w:p>
       <w:r>
-        <w:t>2. Mỗi câu hỏi gồm nội dung và các lựa chọn bên dưới.</w:t>
+        <w:t>2. Đánh dấu câu trả lời đúng bằng '==' ở đầu (ví dụ: == A. Hanoi)</w:t>
       </w:r>
     </w:p>
     <w:p>
       <w:r>
-        <w:t>3. Thêm dấu == vào cuối lựa chọn đúng.</w:t>
+        <w:t>3. Thêm giải thích bằng '//' ở đầu (ví dụ: // Đây là một giải thích)</w:t>
       </w:r>
     </w:p>
     <w:p>
       <w:r>
-        <w:t>4. Bạn có thể sao chép và dán để tạo thêm câu hỏi.</w:t>
+        <w:t>4. Sao chép các ví dụ bên dưới và chỉnh sửa chúng bằng nội dung của riêng bạn</w:t>
+      </w:r>
+    </w:p>
+    <w:p>
+      <w:r>
+        <w:t>5. Hỗ trợ 5 loại: Trắc nghiệm, Đúng/Sai, Điền vào chỗ trống, Ghép nối, Trả lời ngắn</w:t>
       </w:r>
     </w:p>
     <w:p/>
@@ -60,7 +65,7 @@
         <w:pStyle w:val="Heading1"/>
       </w:pPr>
       <w:r>
-        <w:t>CÁC VÍ DỤ MẪU:</w:t>
+        <w:t>CÁC MẪU VÍ DỤ:</w:t>
       </w:r>
     </w:p>
     <w:p/>
@@ -69,22 +74,22 @@
         <w:pStyle w:val="Heading2"/>
       </w:pPr>
       <w:r>
-        <w:t>1. Câu hỏi Trắc nghiệm (Chuẩn)</w:t>
+        <w:t>1. Trắc nghiệm</w:t>
       </w:r>
     </w:p>
     <w:p>
       <w:r>
-        <w:t>Câu 1: Thủ đô của Việt Nam là gì?</w:t>
+        <w:t>Câu hỏi 1: Thủ đô của Việt Nam là gì?</w:t>
       </w:r>
     </w:p>
     <w:p>
       <w:r>
-        <w:t>A. Hà Nội ==</w:t>
+        <w:t>== A. Hanoi</w:t>
       </w:r>
     </w:p>
     <w:p>
       <w:r>
-        <w:t>B. TP. Hồ Chí Minh</w:t>
+        <w:t>B. Thành phố Hồ Chí Minh</w:t>
       </w:r>
     </w:p>
     <w:p>
@@ -99,7 +104,7 @@
     </w:p>
     <w:p>
       <w:r>
-        <w:t>// Hà Nội là thủ đô của Việt Nam.</w:t>
+        <w:t>// Hanoi là thủ đô của Việt Nam kể từ năm 1010.</w:t>
       </w:r>
     </w:p>
     <w:p/>
@@ -108,56 +113,17 @@
         <w:pStyle w:val="Heading2"/>
       </w:pPr>
       <w:r>
-        <w:t>2. Trắc nghiệm (Dạng khác)</w:t>
+        <w:t>2. Đúng / Sai</w:t>
       </w:r>
     </w:p>
     <w:p>
       <w:r>
-        <w:t>Câu 2: Số nào lớn nhất?</w:t>
+        <w:t>Câu hỏi 2: Trái Đất quay quanh Mặt Trời.</w:t>
       </w:r>
     </w:p>
     <w:p>
       <w:r>
-        <w:t>A. 10</w:t>
-      </w:r>
-    </w:p>
-    <w:p>
-      <w:r>
-        <w:t>B. 20</w:t>
-      </w:r>
-    </w:p>
-    <w:p>
-      <w:r>
-        <w:t>C. 30</w:t>
-      </w:r>
-    </w:p>
-    <w:p>
-      <w:r>
-        <w:t>D. 40 ==</w:t>
-      </w:r>
-    </w:p>
-    <w:p>
-      <w:r>
-        <w:t>// 40 là số lớn nhất.</w:t>
-      </w:r>
-    </w:p>
-    <w:p/>
-    <w:p>
-      <w:pPr>
-        <w:pStyle w:val="Heading2"/>
-      </w:pPr>
-      <w:r>
-        <w:t>3. Đúng / Sai</w:t>
-      </w:r>
-    </w:p>
-    <w:p>
-      <w:r>
-        <w:t>Câu 3: Trái đất quay quanh Mặt trời.</w:t>
-      </w:r>
-    </w:p>
-    <w:p>
-      <w:r>
-        <w:t>A. Đúng ==</w:t>
+        <w:t>== A. Đúng</w:t>
       </w:r>
     </w:p>
     <w:p>
@@ -167,7 +133,7 @@
     </w:p>
     <w:p>
       <w:r>
-        <w:t>// Đây là sự thật khoa học.</w:t>
+        <w:t>// Đó là một sự thật khoa học.</w:t>
       </w:r>
     </w:p>
     <w:p/>
@@ -176,17 +142,17 @@
         <w:pStyle w:val="Heading2"/>
       </w:pPr>
       <w:r>
-        <w:t>4. Điền khuyết</w:t>
+        <w:t>3. Điền vào chỗ trống</w:t>
       </w:r>
     </w:p>
     <w:p>
       <w:r>
-        <w:t>Câu 4: Nước sôi ở [100] độ C.</w:t>
+        <w:t>Câu hỏi 3: Nước sôi ở [100] độ Celsius.</w:t>
       </w:r>
     </w:p>
     <w:p>
       <w:r>
-        <w:t>// Ở áp suất tiêu chuẩn, nước sôi ở 100 độ C.</w:t>
+        <w:t>// Ở áp suất chuẩn, nước sôi ở 100 độ Celsius.</w:t>
       </w:r>
     </w:p>
     <w:p/>
@@ -195,12 +161,12 @@
         <w:pStyle w:val="Heading2"/>
       </w:pPr>
       <w:r>
-        <w:t>5. Ghép đôi</w:t>
+        <w:t>4. Ghép nối</w:t>
       </w:r>
     </w:p>
     <w:p>
       <w:r>
-        <w:t>Câu 5: Ghép thủ đô với quốc gia.</w:t>
+        <w:t>Câu hỏi 4: Ghép thủ đô với đất nước.</w:t>
       </w:r>
     </w:p>
     <w:p>
@@ -216,6 +182,30 @@
     <w:p>
       <w:r>
         <w:t>// Hà Nội là thủ đô VN, Tokyo là thủ đô Nhật Bản.</w:t>
+      </w:r>
+    </w:p>
+    <w:p/>
+    <w:p>
+      <w:pPr>
+        <w:pStyle w:val="Heading2"/>
+      </w:pPr>
+      <w:r>
+        <w:t>5. Trả lời ngắn</w:t>
+      </w:r>
+    </w:p>
+    <w:p>
+      <w:r>
+        <w:t>Câu hỏi 5: Ai đã viết Romeo và Juliet?</w:t>
+      </w:r>
+    </w:p>
+    <w:p>
+      <w:r>
+        <w:t>== William Shakespeare</w:t>
+      </w:r>
+    </w:p>
+    <w:p>
+      <w:r>
+        <w:t>// William Shakespeare là tác giả của tác phẩm Romeo và Juliet.</w:t>
       </w:r>
     </w:p>
     <w:p/>

</xml_diff>